<commit_message>
Highlight S.P.B Data Team and competition submission details on top of README and docs with humanized writing
</commit_message>
<xml_diff>
--- a/docs/Automotive_Intelligence_Platform_Documentation.docx
+++ b/docs/Automotive_Intelligence_Platform_Documentation.docx
@@ -29,7 +29,9 @@
         </w:rPr>
         <w:t>Comprehensive Project Documentation, Methodology &amp; Competition Submission Dossier</w:t>
         <w:br/>
-        <w:t>Unstop Tableau Competition (September 2026) | Author: Shivaling Battarki</w:t>
+        <w:t>Unstop Tableau &amp; Data Visualization Challenge (September 2026)</w:t>
+        <w:br/>
+        <w:t>Team: S.P.B Data Team (Shivaling Battarki, Pragatheswaran M, Basawaraj)</w:t>
       </w:r>
     </w:p>
     <w:p>
@@ -1472,6 +1474,75 @@
         <w:t>Two-Wheeler Urban Mobility Foundation: Sub-1 Lakh commuter vehicles (Honda Activa, Hero Splendor) exceed 50 kmpl, providing the foundation for urban affordability.</w:t>
       </w:r>
     </w:p>
+    <w:p>
+      <w:pPr>
+        <w:spacing w:before="280" w:after="80"/>
+      </w:pPr>
+      <w:r>
+        <w:rPr>
+          <w:b/>
+          <w:color w:val="1F4E79"/>
+          <w:sz w:val="28"/>
+        </w:rPr>
+        <w:t>9. Project Team &amp; Acknowledgements</w:t>
+      </w:r>
+    </w:p>
+    <w:p>
+      <w:pPr>
+        <w:pStyle w:val="ListBullet"/>
+        <w:spacing w:after="60" w:line="276" w:lineRule="auto"/>
+      </w:pPr>
+      <w:r>
+        <w:rPr>
+          <w:b/>
+          <w:color w:val="0F172A"/>
+        </w:rPr>
+        <w:t xml:space="preserve">• </w:t>
+      </w:r>
+      <w:r>
+        <w:t>Shivaling Battarki (Team Lead | shivalingb09@gmail.com | GitHub: @Hazardous9hub)</w:t>
+      </w:r>
+    </w:p>
+    <w:p>
+      <w:pPr>
+        <w:pStyle w:val="ListBullet"/>
+        <w:spacing w:after="60" w:line="276" w:lineRule="auto"/>
+      </w:pPr>
+      <w:r>
+        <w:rPr>
+          <w:b/>
+          <w:color w:val="0F172A"/>
+        </w:rPr>
+        <w:t xml:space="preserve">• </w:t>
+      </w:r>
+      <w:r>
+        <w:t>Pragatheswaran M (Data Engineering &amp; Domain Calibration)</w:t>
+      </w:r>
+    </w:p>
+    <w:p>
+      <w:pPr>
+        <w:pStyle w:val="ListBullet"/>
+        <w:spacing w:after="60" w:line="276" w:lineRule="auto"/>
+      </w:pPr>
+      <w:r>
+        <w:rPr>
+          <w:b/>
+          <w:color w:val="0F172A"/>
+        </w:rPr>
+        <w:t xml:space="preserve">• </w:t>
+      </w:r>
+      <w:r>
+        <w:t>Basawaraj (Research &amp; Analytical Validation)</w:t>
+      </w:r>
+    </w:p>
+    <w:p>
+      <w:pPr>
+        <w:spacing w:after="80" w:line="276" w:lineRule="auto"/>
+      </w:pPr>
+      <w:r>
+        <w:t>Competition: Unstop Tableau &amp; Data Visualization Challenge (Phase 2 Submission, September 2026)</w:t>
+      </w:r>
+    </w:p>
     <w:sectPr>
       <w:pgSz w:w="12240" w:h="15840"/>
       <w:pgMar w:top="1440" w:right="1440" w:bottom="1440" w:left="1440" w:header="720" w:footer="720" w:gutter="0"/>

</xml_diff>

<commit_message>
Update complete team member profiles with LinkedIn and GitHub links for S.P.B Data Team
Co-authored-by: Pragatheswaran M <pragathes224@gmail.com>
Co-authored-by: Basawaraj Kale <kale.sbasawaraj@gmail.com>
</commit_message>
<xml_diff>
--- a/docs/Automotive_Intelligence_Platform_Documentation.docx
+++ b/docs/Automotive_Intelligence_Platform_Documentation.docx
@@ -31,7 +31,7 @@
         <w:br/>
         <w:t>Unstop Tableau &amp; Data Visualization Challenge (September 2026)</w:t>
         <w:br/>
-        <w:t>Team: S.P.B Data Team (Shivaling Battarki, Pragatheswaran M, Basawaraj)</w:t>
+        <w:t>Team: S.P.B Data Team (Shivaling Battarki, Pragatheswaran M, Basawaraj Kale)</w:t>
       </w:r>
     </w:p>
     <w:p>
@@ -1500,7 +1500,7 @@
         <w:t xml:space="preserve">• </w:t>
       </w:r>
       <w:r>
-        <w:t>Shivaling Battarki (Team Lead | shivalingb09@gmail.com | GitHub: @Hazardous9hub)</w:t>
+        <w:t>Shivaling Battarki (Team Lead | shivalingb09@gmail.com | GitHub: @Hazardous9hub | LinkedIn: in/shivaling-93000)</w:t>
       </w:r>
     </w:p>
     <w:p>
@@ -1516,7 +1516,7 @@
         <w:t xml:space="preserve">• </w:t>
       </w:r>
       <w:r>
-        <w:t>Pragatheswaran M (Data Engineering &amp; Domain Calibration)</w:t>
+        <w:t>Pragatheswaran M (Data Engineering &amp; Domain Calibration | pragathes224@gmail.com | GitHub: @Pragatheswaran-M | LinkedIn: in/pragatheswaranm)</w:t>
       </w:r>
     </w:p>
     <w:p>
@@ -1532,7 +1532,7 @@
         <w:t xml:space="preserve">• </w:t>
       </w:r>
       <w:r>
-        <w:t>Basawaraj (Research &amp; Analytical Validation)</w:t>
+        <w:t>Basawaraj Kale (Research &amp; Analytical Validation | kale.sbasawaraj@gmail.com | GitHub: @basawaraj849 | LinkedIn: in/basawarajkale)</w:t>
       </w:r>
     </w:p>
     <w:p>
@@ -1540,7 +1540,7 @@
         <w:spacing w:after="80" w:line="276" w:lineRule="auto"/>
       </w:pPr>
       <w:r>
-        <w:t>Competition: Unstop Tableau &amp; Data Visualization Challenge (Phase 2 Submission, September 2026)</w:t>
+        <w:t>Competition: Unstop Tableau &amp; Data Visualization Challenge (National Institute of Engineering - NIE Mysuru, September 2026)</w:t>
       </w:r>
     </w:p>
     <w:sectPr>

</xml_diff>